<commit_message>
Restore Word hyperlinks in articles; fix download paths; rebuild site
</commit_message>
<xml_diff>
--- a/docs/downloads/gc-willis/doc_0164.docx
+++ b/docs/downloads/gc-willis/doc_0164.docx
@@ -637,16 +637,14 @@
         </w:rPr>
         <w:t xml:space="preserve">إن البرَص من الممكن أن يندلع تقريبًا في كل أجزاء الجسم. إنه لم يكن ما فعله الأبرص الذي أدّى إلى نجاسته، وإنما ما كانه هو، ليس أعماله، وإنما حالته. إننا جميعنا يمكننا أن نقول مع داود: "ها أنا </w:t>
       </w:r>
-      <w:proofErr w:type="spellStart"/>
-      <w:r>
-        <w:rPr>
-          <w:rFonts w:hint="cs"/>
-          <w:rtl/>
-          <w:lang w:bidi="ar-AE"/>
-        </w:rPr>
-        <w:t>بالاثم</w:t>
-      </w:r>
-      <w:proofErr w:type="spellEnd"/>
+      <w:r>
+        <w:rPr>
+          <w:rFonts w:hint="cs"/>
+          <w:rtl/>
+          <w:lang w:bidi="ar-AE"/>
+        </w:rPr>
+        <w:t>بالإثم</w:t>
+      </w:r>
       <w:r>
         <w:rPr>
           <w:rFonts w:hint="cs"/>
@@ -1494,19 +1492,11 @@
         </w:rPr>
         <w:t>﻿</w:t>
       </w:r>
-      <w:proofErr w:type="spellStart"/>
-      <w:r>
-        <w:rPr>
-          <w:rtl/>
-        </w:rPr>
-        <w:t>فَإِنْ</w:t>
-      </w:r>
-      <w:proofErr w:type="spellEnd"/>
-      <w:r>
-        <w:rPr>
-          <w:rtl/>
-        </w:rPr>
-        <w:t xml:space="preserve"> رَأَى الْكَاهِنُ الضَّرْبَةَ فِي جِلْدِ الْجَسَدِ، وَفِي الضَّرْبَةِ شَعَرٌ قَدِ ابْيَضَّ، وَمَنْظَرُ الضَّرْبَةِ أَعْمَقُ مِنْ جِلْدِ جَسَدِهِ، فَهِيَ ضَرْبَةُ بَرَصٍ. فَمَتَى رَآهُ الْكَاهِنُ يَحْكُمُ بِنَجَاسَتِهِ. </w:t>
+      <w:r>
+        <w:rPr>
+          <w:rtl/>
+        </w:rPr>
+        <w:t xml:space="preserve">فَإِنْ رَأَى الْكَاهِنُ الضَّرْبَةَ فِي جِلْدِ الْجَسَدِ، وَفِي الضَّرْبَةِ شَعَرٌ قَدِ ابْيَضَّ، وَمَنْظَرُ الضَّرْبَةِ أَعْمَقُ مِنْ جِلْدِ جَسَدِهِ، فَهِيَ ضَرْبَةُ بَرَصٍ. فَمَتَى رَآهُ الْكَاهِنُ يَحْكُمُ بِنَجَاسَتِهِ. </w:t>
       </w:r>
       <w:r>
         <w:rPr>
@@ -1552,19 +1542,11 @@
         </w:rPr>
         <w:t>﻿</w:t>
       </w:r>
-      <w:proofErr w:type="spellStart"/>
-      <w:r>
-        <w:rPr>
-          <w:rtl/>
-        </w:rPr>
-        <w:t>لكِنْ</w:t>
-      </w:r>
-      <w:proofErr w:type="spellEnd"/>
-      <w:r>
-        <w:rPr>
-          <w:rtl/>
-        </w:rPr>
-        <w:t xml:space="preserve"> إِنْ كَانَتِ الضَّرْبَةُ لُمْعَةً بَيْضَاءَ فِي جِلْدِ جَسَدِهِ، وَلَمْ يَكُنْ مَنْظَرُهَا أَعْمَقَ مِنَ الْجِلْدِ، وَلَمْ يَبْيَضَّ شَعْرُهَا، يَحْجُزُ الْكَاهِنُ الْمَضْرُوبَ سَبْعَةَ أَيَّامٍ. </w:t>
+      <w:r>
+        <w:rPr>
+          <w:rtl/>
+        </w:rPr>
+        <w:t xml:space="preserve">لكِنْ إِنْ كَانَتِ الضَّرْبَةُ لُمْعَةً بَيْضَاءَ فِي جِلْدِ جَسَدِهِ، وَلَمْ يَكُنْ مَنْظَرُهَا أَعْمَقَ مِنَ الْجِلْدِ، وَلَمْ يَبْيَضَّ شَعْرُهَا، يَحْجُزُ الْكَاهِنُ الْمَضْرُوبَ سَبْعَةَ أَيَّامٍ. </w:t>
       </w:r>
       <w:r>
         <w:rPr>
@@ -1610,19 +1592,11 @@
         </w:rPr>
         <w:t>﻿</w:t>
       </w:r>
-      <w:proofErr w:type="spellStart"/>
-      <w:r>
-        <w:rPr>
-          <w:rtl/>
-        </w:rPr>
-        <w:t>فَإِنْ</w:t>
-      </w:r>
-      <w:proofErr w:type="spellEnd"/>
-      <w:r>
-        <w:rPr>
-          <w:rtl/>
-        </w:rPr>
-        <w:t xml:space="preserve"> رَآهُ الْكَاهِنُ فِي الْيَوْمِ السَّابعِ وَإِذَا فِي عَيْنِهِ الضَّرْبَةُ قَدْ وَقَفَتْ، وَلَمْ تَمْتَدَّ الضَّرْبَةُ فِي الْجِلْدِ، يَحْجُزُهُ الْكَاهِنُ سَبْعَةَ أَيَّامٍ ثَانِيَةً.</w:t>
+      <w:r>
+        <w:rPr>
+          <w:rtl/>
+        </w:rPr>
+        <w:t>فَإِنْ رَآهُ الْكَاهِنُ فِي الْيَوْمِ السَّابعِ وَإِذَا فِي عَيْنِهِ الضَّرْبَةُ قَدْ وَقَفَتْ، وَلَمْ تَمْتَدَّ الضَّرْبَةُ فِي الْجِلْدِ، يَحْجُزُهُ الْكَاهِنُ سَبْعَةَ أَيَّامٍ ثَانِيَةً.</w:t>
       </w:r>
       <w:r>
         <w:rPr>
@@ -1857,19 +1831,11 @@
         </w:rPr>
         <w:t>﻿</w:t>
       </w:r>
-      <w:proofErr w:type="spellStart"/>
-      <w:r>
-        <w:rPr>
-          <w:rtl/>
-        </w:rPr>
-        <w:t>إِذِ</w:t>
-      </w:r>
-      <w:proofErr w:type="spellEnd"/>
-      <w:r>
-        <w:rPr>
-          <w:rtl/>
-        </w:rPr>
-        <w:t xml:space="preserve"> الْجَمِيعُ أَخْطَأُوا وَأَعْوَزَهُمْ مَجْدُ اللهِ،</w:t>
+      <w:r>
+        <w:rPr>
+          <w:rtl/>
+        </w:rPr>
+        <w:t>إِذِ الْجَمِيعُ أَخْطَأُوا وَأَعْوَزَهُمْ مَجْدُ اللهِ،</w:t>
       </w:r>
       <w:r>
         <w:rPr>
@@ -2021,19 +1987,11 @@
         </w:rPr>
         <w:t>﻿</w:t>
       </w:r>
-      <w:proofErr w:type="spellStart"/>
-      <w:r>
-        <w:rPr>
-          <w:rtl/>
-        </w:rPr>
-        <w:t>وَرَأَى</w:t>
-      </w:r>
-      <w:proofErr w:type="spellEnd"/>
-      <w:r>
-        <w:rPr>
-          <w:rtl/>
-        </w:rPr>
-        <w:t xml:space="preserve"> اللهُ كُلَّ مَا عَمِلَهُ فَإِذَا هُوَ حَسَنٌ جِدًّا</w:t>
+      <w:r>
+        <w:rPr>
+          <w:rtl/>
+        </w:rPr>
+        <w:t>وَرَأَى اللهُ كُلَّ مَا عَمِلَهُ فَإِذَا هُوَ حَسَنٌ جِدًّا</w:t>
       </w:r>
       <w:r>
         <w:rPr>
@@ -2067,19 +2025,11 @@
         </w:rPr>
         <w:t>﻿</w:t>
       </w:r>
-      <w:proofErr w:type="spellStart"/>
-      <w:r>
-        <w:rPr>
-          <w:rtl/>
-        </w:rPr>
-        <w:t>وَرَأَى</w:t>
-      </w:r>
-      <w:proofErr w:type="spellEnd"/>
-      <w:r>
-        <w:rPr>
-          <w:rtl/>
-        </w:rPr>
-        <w:t xml:space="preserve"> الرَّبُّ أَنَّ شَرَّ الإِنْسَانِ قَدْ كَثُرَ فِي الأَرْضِ، وَأَنَّ كُلَّ تَصَوُّرِ أَفْكَارِ قَلْبِهِ إِنَّمَا هُوَ شِرِّيرٌ كُلَّ يَوْمٍ.</w:t>
+      <w:r>
+        <w:rPr>
+          <w:rtl/>
+        </w:rPr>
+        <w:t>وَرَأَى الرَّبُّ أَنَّ شَرَّ الإِنْسَانِ قَدْ كَثُرَ فِي الأَرْضِ، وَأَنَّ كُلَّ تَصَوُّرِ أَفْكَارِ قَلْبِهِ إِنَّمَا هُوَ شِرِّيرٌ كُلَّ يَوْمٍ.</w:t>
       </w:r>
       <w:r>
         <w:rPr>
@@ -2105,19 +2055,11 @@
         </w:rPr>
         <w:t>﻿</w:t>
       </w:r>
-      <w:proofErr w:type="spellStart"/>
-      <w:r>
-        <w:rPr>
-          <w:rtl/>
-        </w:rPr>
-        <w:t>اَلرَّبُّ</w:t>
-      </w:r>
-      <w:proofErr w:type="spellEnd"/>
-      <w:r>
-        <w:rPr>
-          <w:rtl/>
-        </w:rPr>
-        <w:t xml:space="preserve"> مِنَ السَّمَاءِ أَشْرَفَ عَلَى بَنِي الْبَشَرِ، لِيَنْظُرَ: هَلْ مِنْ فَاهِمٍ طَالِبِ اللهِ؟ </w:t>
+      <w:r>
+        <w:rPr>
+          <w:rtl/>
+        </w:rPr>
+        <w:t xml:space="preserve">اَلرَّبُّ مِنَ السَّمَاءِ أَشْرَفَ عَلَى بَنِي الْبَشَرِ، لِيَنْظُرَ: هَلْ مِنْ فَاهِمٍ طَالِبِ اللهِ؟ </w:t>
       </w:r>
       <w:r>
         <w:rPr>
@@ -2163,19 +2105,11 @@
         </w:rPr>
         <w:t>﻿</w:t>
       </w:r>
-      <w:proofErr w:type="spellStart"/>
-      <w:r>
-        <w:rPr>
-          <w:rtl/>
-        </w:rPr>
-        <w:t>الْكُلُّ</w:t>
-      </w:r>
-      <w:proofErr w:type="spellEnd"/>
-      <w:r>
-        <w:rPr>
-          <w:rtl/>
-        </w:rPr>
-        <w:t xml:space="preserve"> قَدْ زَاغُوا مَعًا، فَسَدُوا. لَيْسَ مَنْ يَعْمَلُ صَلاَحًا، لَيْسَ وَلاَ وَاحِدٌ.</w:t>
+      <w:r>
+        <w:rPr>
+          <w:rtl/>
+        </w:rPr>
+        <w:t>الْكُلُّ قَدْ زَاغُوا مَعًا، فَسَدُوا. لَيْسَ مَنْ يَعْمَلُ صَلاَحًا، لَيْسَ وَلاَ وَاحِدٌ.</w:t>
       </w:r>
       <w:r>
         <w:rPr>

</xml_diff>